<commit_message>
add code fine tune e5_base model
</commit_message>
<xml_diff>
--- a/embedding_project/outputs/evaluation/bao_cao_thu_nghiem_e5_base_v2.docx
+++ b/embedding_project/outputs/evaluation/bao_cao_thu_nghiem_e5_base_v2.docx
@@ -4,58 +4,46 @@
   <w:body>
     <w:p>
       <w:pPr>
+        <w:pStyle w:val="Title"/>
         <w:jc w:val="center"/>
       </w:pPr>
       <w:r>
-        <w:rPr>
-          <w:b/>
-          <w:sz w:val="32"/>
-        </w:rPr>
         <w:t>BÁO CÁO THỬ NGHIỆM MÔ HÌNH intfloat/multilingual-e5-base</w:t>
       </w:r>
     </w:p>
     <w:p>
-      <w:pPr>
-        <w:jc w:val="center"/>
-      </w:pPr>
       <w:r>
-        <w:rPr>
-          <w:i/>
-        </w:rPr>
         <w:t>Dự án: embedding_project</w:t>
       </w:r>
     </w:p>
     <w:p>
       <w:r>
-        <w:rPr>
-          <w:b/>
-          <w:sz w:val="26"/>
-        </w:rPr>
+        <w:t>Ngày cập nhật: 03/06/2026</w:t>
+      </w:r>
+    </w:p>
+    <w:p>
+      <w:pPr>
+        <w:pStyle w:val="Heading1"/>
+      </w:pPr>
+      <w:r>
         <w:t>1. Mục tiêu</w:t>
       </w:r>
     </w:p>
     <w:p>
-      <w:pPr>
-        <w:pStyle w:val="ListBullet"/>
-      </w:pPr>
       <w:r>
         <w:t>Đánh giá chất lượng truy hồi ngữ nghĩa của mô hình intfloat/multilingual-e5-base trên tập test đã làm sạch.</w:t>
       </w:r>
     </w:p>
     <w:p>
-      <w:pPr>
-        <w:pStyle w:val="ListBullet"/>
-      </w:pPr>
       <w:r>
-        <w:t>Ghi nhận kết quả đánh giá ban đầu trước khi tiến hành fine-tuning hoặc tinh chỉnh thêm.</w:t>
+        <w:t>Ghi nhận kết quả pretrained làm baseline và kết quả sau fine-tune (e5_base_finetuned_final).</w:t>
       </w:r>
     </w:p>
     <w:p>
+      <w:pPr>
+        <w:pStyle w:val="Heading1"/>
+      </w:pPr>
       <w:r>
-        <w:rPr>
-          <w:b/>
-          <w:sz w:val="26"/>
-        </w:rPr>
         <w:t>2. Cấu hình thử nghiệm</w:t>
       </w:r>
     </w:p>
@@ -72,7 +60,15 @@
         <w:pStyle w:val="ListBullet"/>
       </w:pPr>
       <w:r>
-        <w:t>Preset sử dụng: e5-base</w:t>
+        <w:t>Model fine-tuned: embedding_project/models/e5_base_finetuned_final/</w:t>
+      </w:r>
+    </w:p>
+    <w:p>
+      <w:pPr>
+        <w:pStyle w:val="ListBullet"/>
+      </w:pPr>
+      <w:r>
+        <w:t>Preset: e5-base</w:t>
       </w:r>
     </w:p>
     <w:p>
@@ -88,7 +84,7 @@
         <w:pStyle w:val="ListBullet"/>
       </w:pPr>
       <w:r>
-        <w:t>Chỉ số đánh giá: Precision@10, Recall@10, MRR@10, NDCG@10</w:t>
+        <w:t>Chỉ số: Precision@10, Recall@10, MRR@10, NDCG@10 (K = 10)</w:t>
       </w:r>
     </w:p>
     <w:p>
@@ -100,12 +96,32 @@
       </w:r>
     </w:p>
     <w:p>
+      <w:pPr>
+        <w:pStyle w:val="ListBullet"/>
+      </w:pPr>
       <w:r>
-        <w:rPr>
-          <w:b/>
-          <w:sz w:val="26"/>
-        </w:rPr>
-        <w:t>3. Kết quả đánh giá trên tập test</w:t>
+        <w:t>Pipeline: encode → L2 normalize → cosine (dot product) → top-10 product_id</w:t>
+      </w:r>
+    </w:p>
+    <w:p>
+      <w:pPr>
+        <w:pStyle w:val="ListBullet"/>
+      </w:pPr>
+      <w:r>
+        <w:t>Script đánh giá: embedding_project/scripts/evaluate_embedding_model.py</w:t>
+      </w:r>
+    </w:p>
+    <w:p>
+      <w:pPr>
+        <w:pStyle w:val="Heading1"/>
+      </w:pPr>
+      <w:r>
+        <w:t>3. Kết quả đánh giá pretrained</w:t>
+      </w:r>
+    </w:p>
+    <w:p>
+      <w:r>
+        <w:t>Kết quả model gốc (chưa fine-tune) trên tập test — làm mốc so sánh.</w:t>
       </w:r>
     </w:p>
     <w:tbl>
@@ -157,7 +173,7 @@
           </w:tcPr>
           <w:p>
             <w:r>
-              <w:t>0.11422924901185771</w:t>
+              <w:t>0.114229</w:t>
             </w:r>
           </w:p>
         </w:tc>
@@ -179,7 +195,7 @@
           </w:tcPr>
           <w:p>
             <w:r>
-              <w:t>0.8815432956737305</w:t>
+              <w:t>0.881543</w:t>
             </w:r>
           </w:p>
         </w:tc>
@@ -201,7 +217,7 @@
           </w:tcPr>
           <w:p>
             <w:r>
-              <w:t>0.7508417508417509</w:t>
+              <w:t>0.750842</w:t>
             </w:r>
           </w:p>
         </w:tc>
@@ -223,24 +239,18 @@
           </w:tcPr>
           <w:p>
             <w:r>
-              <w:t>0.7753283927311034</w:t>
+              <w:t>0.775328</w:t>
             </w:r>
           </w:p>
         </w:tc>
       </w:tr>
     </w:tbl>
     <w:p>
+      <w:pPr>
+        <w:pStyle w:val="Heading1"/>
+      </w:pPr>
       <w:r>
-        <w:t>Ghi chú: đây là kết quả pretrained ở preset e5-base với k = 10.</w:t>
-      </w:r>
-    </w:p>
-    <w:p>
-      <w:r>
-        <w:rPr>
-          <w:b/>
-          <w:sz w:val="26"/>
-        </w:rPr>
-        <w:t>4. Nhận xét</w:t>
+        <w:t>4. Nhận xét pretrained</w:t>
       </w:r>
     </w:p>
     <w:p>
@@ -248,7 +258,7 @@
         <w:pStyle w:val="ListBullet"/>
       </w:pPr>
       <w:r>
-        <w:t>Recall@10 đạt mức cao, cho thấy mô hình pretrained có khả năng bao phủ tốt các sản phẩm liên quan trong top 10.</w:t>
+        <w:t>Recall@10 = 88.2% — bao phủ relevant trong top-10 khá tốt.</w:t>
       </w:r>
     </w:p>
     <w:p>
@@ -256,7 +266,7 @@
         <w:pStyle w:val="ListBullet"/>
       </w:pPr>
       <w:r>
-        <w:t>MRR@10 và NDCG@10 ở mức khá tốt, nghĩa là các kết quả đúng thường xuất hiện ở vị trí tương đối cao.</w:t>
+        <w:t>MRR@10 = 0.751, NDCG@10 = 0.775 — xếp hạng ở mức khá.</w:t>
       </w:r>
     </w:p>
     <w:p>
@@ -264,16 +274,208 @@
         <w:pStyle w:val="ListBullet"/>
       </w:pPr>
       <w:r>
-        <w:t>Precision@10 vẫn còn thấp hơn mức mong muốn, nên danh sách top 10 vẫn còn chứa một số kết quả nhiễu.</w:t>
+        <w:t>Precision@10 = 11.4% — top-10 vẫn có nhiễu (corpus ~2.000 sản phẩm).</w:t>
+      </w:r>
+    </w:p>
+    <w:p>
+      <w:pPr>
+        <w:pStyle w:val="Heading1"/>
+      </w:pPr>
+      <w:r>
+        <w:t>5. Kết quả đánh giá fine-tuned (e5_base_finetuned_final)</w:t>
       </w:r>
     </w:p>
     <w:p>
       <w:r>
-        <w:rPr>
-          <w:b/>
-          <w:sz w:val="26"/>
-        </w:rPr>
-        <w:t>5. Kết luận</w:t>
+        <w:t>Đánh giá model sau fine-tune trên cùng tập test và pipeline (MultipleNegativesRankingLoss, 1 epoch, huấn luyện trên train_cleaned.jsonl / valid_cleaned.jsonl).</w:t>
+      </w:r>
+    </w:p>
+    <w:p>
+      <w:pPr>
+        <w:pStyle w:val="Heading2"/>
+      </w:pPr>
+      <w:r>
+        <w:t>5.1. Bảng metric fine-tuned</w:t>
+      </w:r>
+    </w:p>
+    <w:tbl>
+      <w:tblPr>
+        <w:tblStyle w:val="TableGrid"/>
+        <w:tblW w:type="auto" w:w="0"/>
+        <w:tblLook w:firstColumn="1" w:firstRow="1" w:lastColumn="0" w:lastRow="0" w:noHBand="0" w:noVBand="1" w:val="04A0"/>
+      </w:tblPr>
+      <w:tblGrid>
+        <w:gridCol w:w="2880"/>
+        <w:gridCol w:w="2880"/>
+        <w:gridCol w:w="2880"/>
+      </w:tblGrid>
+      <w:tr>
+        <w:tc>
+          <w:tcPr>
+            <w:tcW w:type="dxa" w:w="2880"/>
+          </w:tcPr>
+          <w:p>
+            <w:r>
+              <w:t>Metric</w:t>
+            </w:r>
+          </w:p>
+        </w:tc>
+        <w:tc>
+          <w:tcPr>
+            <w:tcW w:type="dxa" w:w="2880"/>
+          </w:tcPr>
+          <w:p>
+            <w:r>
+              <w:t>Fine-tuned</w:t>
+            </w:r>
+          </w:p>
+        </w:tc>
+        <w:tc>
+          <w:tcPr>
+            <w:tcW w:type="dxa" w:w="2880"/>
+          </w:tcPr>
+          <w:p>
+            <w:r>
+              <w:t>Δ (so với pretrained)</w:t>
+            </w:r>
+          </w:p>
+        </w:tc>
+      </w:tr>
+      <w:tr>
+        <w:tc>
+          <w:tcPr>
+            <w:tcW w:type="dxa" w:w="2880"/>
+          </w:tcPr>
+          <w:p>
+            <w:r>
+              <w:t>NDCG@10</w:t>
+            </w:r>
+          </w:p>
+        </w:tc>
+        <w:tc>
+          <w:tcPr>
+            <w:tcW w:type="dxa" w:w="2880"/>
+          </w:tcPr>
+          <w:p>
+            <w:r>
+              <w:t>0.895</w:t>
+            </w:r>
+          </w:p>
+        </w:tc>
+        <w:tc>
+          <w:tcPr>
+            <w:tcW w:type="dxa" w:w="2880"/>
+          </w:tcPr>
+          <w:p>
+            <w:r>
+              <w:t>+15.5%</w:t>
+            </w:r>
+          </w:p>
+        </w:tc>
+      </w:tr>
+      <w:tr>
+        <w:tc>
+          <w:tcPr>
+            <w:tcW w:type="dxa" w:w="2880"/>
+          </w:tcPr>
+          <w:p>
+            <w:r>
+              <w:t>Precision@10</w:t>
+            </w:r>
+          </w:p>
+        </w:tc>
+        <w:tc>
+          <w:tcPr>
+            <w:tcW w:type="dxa" w:w="2880"/>
+          </w:tcPr>
+          <w:p>
+            <w:r>
+              <w:t>0.132</w:t>
+            </w:r>
+          </w:p>
+        </w:tc>
+        <w:tc>
+          <w:tcPr>
+            <w:tcW w:type="dxa" w:w="2880"/>
+          </w:tcPr>
+          <w:p>
+            <w:r>
+              <w:t>+15.2%</w:t>
+            </w:r>
+          </w:p>
+        </w:tc>
+      </w:tr>
+      <w:tr>
+        <w:tc>
+          <w:tcPr>
+            <w:tcW w:type="dxa" w:w="2880"/>
+          </w:tcPr>
+          <w:p>
+            <w:r>
+              <w:t>Recall@10</w:t>
+            </w:r>
+          </w:p>
+        </w:tc>
+        <w:tc>
+          <w:tcPr>
+            <w:tcW w:type="dxa" w:w="2880"/>
+          </w:tcPr>
+          <w:p>
+            <w:r>
+              <w:t>0.978</w:t>
+            </w:r>
+          </w:p>
+        </w:tc>
+        <w:tc>
+          <w:tcPr>
+            <w:tcW w:type="dxa" w:w="2880"/>
+          </w:tcPr>
+          <w:p>
+            <w:r>
+              <w:t>+10.9%</w:t>
+            </w:r>
+          </w:p>
+        </w:tc>
+      </w:tr>
+      <w:tr>
+        <w:tc>
+          <w:tcPr>
+            <w:tcW w:type="dxa" w:w="2880"/>
+          </w:tcPr>
+          <w:p>
+            <w:r>
+              <w:t>MRR@10</w:t>
+            </w:r>
+          </w:p>
+        </w:tc>
+        <w:tc>
+          <w:tcPr>
+            <w:tcW w:type="dxa" w:w="2880"/>
+          </w:tcPr>
+          <w:p>
+            <w:r>
+              <w:t>0.872</w:t>
+            </w:r>
+          </w:p>
+        </w:tc>
+        <w:tc>
+          <w:tcPr>
+            <w:tcW w:type="dxa" w:w="2880"/>
+          </w:tcPr>
+          <w:p>
+            <w:r>
+              <w:t>+16.2%</w:t>
+            </w:r>
+          </w:p>
+        </w:tc>
+      </w:tr>
+    </w:tbl>
+    <w:p>
+      <w:pPr>
+        <w:pStyle w:val="Heading2"/>
+      </w:pPr>
+      <w:r>
+        <w:t>5.2. Nhận xét fine-tuned</w:t>
       </w:r>
     </w:p>
     <w:p>
@@ -281,7 +483,7 @@
         <w:pStyle w:val="ListBullet"/>
       </w:pPr>
       <w:r>
-        <w:t>intfloat/multilingual-e5-base là baseline mạnh cho bài toán semantic search đa ngôn ngữ.</w:t>
+        <w:t>NDCG@10: 0.775 → 0.895 (+15.5%).</w:t>
       </w:r>
     </w:p>
     <w:p>
@@ -289,12 +491,68 @@
         <w:pStyle w:val="ListBullet"/>
       </w:pPr>
       <w:r>
-        <w:t>Kết quả pretrained hiện tại đủ tốt để làm mốc so sánh cho các lần fine-tune tiếp theo.</w:t>
+        <w:t>Recall@10: 88.2% → 97.8% — gần như toàn bộ relevant trong top-10.</w:t>
+      </w:r>
+    </w:p>
+    <w:p>
+      <w:pPr>
+        <w:pStyle w:val="ListBullet"/>
+      </w:pPr>
+      <w:r>
+        <w:t>MRR@10: 0.751 → 0.872 — relevant đầu tiên lên vị trí cao hơn.</w:t>
+      </w:r>
+    </w:p>
+    <w:p>
+      <w:pPr>
+        <w:pStyle w:val="ListBullet"/>
+      </w:pPr>
+      <w:r>
+        <w:t>Precision@10: 11.4% → 13.2% — cải thiện nhẹ; top-10 vẫn có nhiễu.</w:t>
+      </w:r>
+    </w:p>
+    <w:p>
+      <w:pPr>
+        <w:pStyle w:val="ListBullet"/>
+      </w:pPr>
+      <w:r>
+        <w:t>Fine-tune giúp metric retrieval tốt hơn pretrained trên cùng pipeline; phù hợp làm model embedding chính cho semantic search.</w:t>
       </w:r>
     </w:p>
     <w:p>
       <w:r>
-        <w:t>Báo cáo đã được cập nhật với số liệu thực tế của lượt test pretrained e5-base.</w:t>
+        <w:t>Nguồn số liệu: embedding_project/outputs/evaluation/metrics_e5_base.json (đánh giá local, --only-finetuned cho fine-tuned; file JSON có cả pretrained để đối chiếu).</w:t>
+      </w:r>
+    </w:p>
+    <w:p>
+      <w:pPr>
+        <w:pStyle w:val="Heading1"/>
+      </w:pPr>
+      <w:r>
+        <w:t>6. Kết luận</w:t>
+      </w:r>
+    </w:p>
+    <w:p>
+      <w:pPr>
+        <w:pStyle w:val="ListBullet"/>
+      </w:pPr>
+      <w:r>
+        <w:t>E5-base pretrained là baseline mạnh cho semantic search đa ngôn ngữ.</w:t>
+      </w:r>
+    </w:p>
+    <w:p>
+      <w:pPr>
+        <w:pStyle w:val="ListBullet"/>
+      </w:pPr>
+      <w:r>
+        <w:t>Fine-tune trên dữ liệu tiếng Việt cải thiện rõ NDCG, Recall và MRR so với pretrained.</w:t>
+      </w:r>
+    </w:p>
+    <w:p>
+      <w:pPr>
+        <w:pStyle w:val="ListBullet"/>
+      </w:pPr>
+      <w:r>
+        <w:t>Model triển khai: embedding_project/models/e5_base_finetuned_final/.</w:t>
       </w:r>
     </w:p>
     <w:sectPr>
@@ -670,10 +928,6 @@
     <w:name w:val="Normal"/>
     <w:qFormat/>
     <w:rsid w:val="00FC693F"/>
-    <w:rPr>
-      <w:rFonts w:ascii="Times New Roman" w:hAnsi="Times New Roman" w:eastAsia="Times New Roman"/>
-      <w:sz w:val="24"/>
-    </w:rPr>
   </w:style>
   <w:style w:type="paragraph" w:styleId="Header">
     <w:name w:val="header"/>

</xml_diff>